<commit_message>
Update PDF conversion service, services, and add VI 10 machine type HMI docs
</commit_message>
<xml_diff>
--- a/IQOQDQ/OQ_HMI/Machine type/FP 10/View_ProductionSubNavigationViewRunTaskButtonView.docx
+++ b/IQOQDQ/OQ_HMI/Machine type/FP 10/View_ProductionSubNavigationViewRunTaskButtonView.docx
@@ -80,10 +80,10 @@
                 <w:noProof/>
               </w:rPr>
               <w:drawing>
-                <wp:inline distT="0" distB="0" distL="0" distR="0" wp14:anchorId="5C84E493" wp14:editId="7141D2FC">
+                <wp:inline distT="0" distB="0" distL="0" distR="0" wp14:anchorId="0801F183" wp14:editId="204217C1">
                   <wp:extent cx="5972175" cy="3357245"/>
                   <wp:effectExtent l="0" t="0" r="9525" b="0"/>
-                  <wp:docPr id="1449867485" name="Picture 11"/>
+                  <wp:docPr id="861954694" name="Picture 1"/>
                   <wp:cNvGraphicFramePr>
                     <a:graphicFrameLocks xmlns:a="http://schemas.openxmlformats.org/drawingml/2006/main" noChangeAspect="1"/>
                   </wp:cNvGraphicFramePr>
@@ -91,7 +91,7 @@
                     <a:graphicData uri="http://schemas.openxmlformats.org/drawingml/2006/picture">
                       <pic:pic xmlns:pic="http://schemas.openxmlformats.org/drawingml/2006/picture">
                         <pic:nvPicPr>
-                          <pic:cNvPr id="0" name="Picture 6"/>
+                          <pic:cNvPr id="0" name="Picture 1"/>
                           <pic:cNvPicPr>
                             <a:picLocks noChangeAspect="1" noChangeArrowheads="1"/>
                           </pic:cNvPicPr>

</xml_diff>